<commit_message>
Updated templates to use singular references, updated some question text, and added new option for whether user wants to add other relief to answer
</commit_message>
<xml_diff>
--- a/docassemble/VTSuperiorCourtDebtAnswer/data/templates/include_signature.docx
+++ b/docassemble/VTSuperiorCourtDebtAnswer/data/templates/include_signature.docx
@@ -8,88 +8,360 @@
       </w:r>
     </w:p>
     <w:p>
-      <w:r>
-        <w:t>{%p if users | length &gt; 1 %}</w:t>
+      <w:proofErr w:type="gramStart"/>
+      <w:r>
+        <w:t>{{ users</w:t>
+      </w:r>
+      <w:proofErr w:type="gramEnd"/>
+      <w:r>
+        <w:t>[0</w:t>
+      </w:r>
+      <w:proofErr w:type="gramStart"/>
+      <w:r>
+        <w:t>].</w:t>
+      </w:r>
+      <w:proofErr w:type="spellStart"/>
+      <w:r>
+        <w:t>signature</w:t>
+      </w:r>
+      <w:proofErr w:type="gramEnd"/>
+      <w:r>
+        <w:t>_if_final</w:t>
+      </w:r>
+      <w:proofErr w:type="spellEnd"/>
+      <w:r>
+        <w:t>(</w:t>
+      </w:r>
+      <w:proofErr w:type="spellStart"/>
+      <w:r>
+        <w:t>i</w:t>
+      </w:r>
+      <w:proofErr w:type="spellEnd"/>
+      <w:proofErr w:type="gramStart"/>
+      <w:r>
+        <w:t>) }</w:t>
+      </w:r>
+      <w:proofErr w:type="gramEnd"/>
+      <w:r>
+        <w:t>}</w:t>
       </w:r>
     </w:p>
     <w:p>
-      <w:r>
-        <w:t>{{ users[0].signature_if_final(i) }}</w:t>
+      <w:proofErr w:type="gramStart"/>
+      <w:r>
+        <w:t>{{ users</w:t>
+      </w:r>
+      <w:proofErr w:type="gramEnd"/>
+      <w:r>
+        <w:t>[0</w:t>
+      </w:r>
+      <w:proofErr w:type="gramStart"/>
+      <w:r>
+        <w:t>] }</w:t>
+      </w:r>
+      <w:proofErr w:type="gramEnd"/>
+      <w:r>
+        <w:t>}</w:t>
       </w:r>
     </w:p>
     <w:p>
       <w:r>
-        <w:t>{{ users[0] }}</w:t>
+        <w:t>{%p if users1_mailing_address_different %}</w:t>
       </w:r>
     </w:p>
     <w:p>
-      <w:r>
-        <w:t>{{ users[0].address.line_one() }}</w:t>
+      <w:proofErr w:type="gramStart"/>
+      <w:r>
+        <w:t>{{ users</w:t>
+      </w:r>
+      <w:proofErr w:type="gramEnd"/>
+      <w:r>
+        <w:t>[0</w:t>
+      </w:r>
+      <w:proofErr w:type="gramStart"/>
+      <w:r>
+        <w:t>].</w:t>
+      </w:r>
+      <w:proofErr w:type="spellStart"/>
+      <w:r>
+        <w:t>mailing</w:t>
+      </w:r>
+      <w:proofErr w:type="gramEnd"/>
+      <w:r>
+        <w:t>_</w:t>
+      </w:r>
+      <w:proofErr w:type="gramStart"/>
+      <w:r>
+        <w:t>address.line</w:t>
+      </w:r>
+      <w:proofErr w:type="gramEnd"/>
+      <w:r>
+        <w:t>_</w:t>
+      </w:r>
+      <w:proofErr w:type="gramStart"/>
+      <w:r>
+        <w:t>one</w:t>
+      </w:r>
+      <w:proofErr w:type="spellEnd"/>
+      <w:r>
+        <w:t>() }</w:t>
+      </w:r>
+      <w:proofErr w:type="gramEnd"/>
+      <w:r>
+        <w:t>}</w:t>
       </w:r>
     </w:p>
     <w:p>
-      <w:r>
-        <w:t>{{ users[0].address.line_two() }}</w:t>
+      <w:proofErr w:type="gramStart"/>
+      <w:r>
+        <w:t>{{ users</w:t>
+      </w:r>
+      <w:proofErr w:type="gramEnd"/>
+      <w:r>
+        <w:t>[0</w:t>
+      </w:r>
+      <w:proofErr w:type="gramStart"/>
+      <w:r>
+        <w:t>].</w:t>
+      </w:r>
+      <w:proofErr w:type="spellStart"/>
+      <w:r>
+        <w:t>mailing</w:t>
+      </w:r>
+      <w:proofErr w:type="gramEnd"/>
+      <w:r>
+        <w:t>_</w:t>
+      </w:r>
+      <w:proofErr w:type="gramStart"/>
+      <w:r>
+        <w:t>address.line</w:t>
+      </w:r>
+      <w:proofErr w:type="gramEnd"/>
+      <w:r>
+        <w:t>_</w:t>
+      </w:r>
+      <w:proofErr w:type="gramStart"/>
+      <w:r>
+        <w:t>two</w:t>
+      </w:r>
+      <w:proofErr w:type="spellEnd"/>
+      <w:r>
+        <w:t>() }</w:t>
+      </w:r>
+      <w:proofErr w:type="gramEnd"/>
+      <w:r>
+        <w:t>}</w:t>
       </w:r>
     </w:p>
     <w:p>
       <w:r>
-        <w:t>{{ showifdef("users[0].email") }}</w:t>
+        <w:t>{%p else %}</w:t>
       </w:r>
     </w:p>
     <w:p>
-      <w:r>
-        <w:t>{{ showifdef("users[0].phone_number") }}</w:t>
+      <w:proofErr w:type="gramStart"/>
+      <w:r>
+        <w:t>{{ users</w:t>
+      </w:r>
+      <w:proofErr w:type="gramEnd"/>
+      <w:r>
+        <w:t>[0</w:t>
+      </w:r>
+      <w:proofErr w:type="gramStart"/>
+      <w:r>
+        <w:t>].</w:t>
+      </w:r>
+      <w:proofErr w:type="spellStart"/>
+      <w:r>
+        <w:t>address</w:t>
+      </w:r>
+      <w:proofErr w:type="gramEnd"/>
+      <w:r>
+        <w:t>.line_</w:t>
+      </w:r>
+      <w:proofErr w:type="gramStart"/>
+      <w:r>
+        <w:t>one</w:t>
+      </w:r>
+      <w:proofErr w:type="spellEnd"/>
+      <w:r>
+        <w:t>() }</w:t>
+      </w:r>
+      <w:proofErr w:type="gramEnd"/>
+      <w:r>
+        <w:t>}</w:t>
       </w:r>
     </w:p>
     <w:p>
-      <w:r>
-        <w:t>Defendants (self-represented/pro se)</w:t>
+      <w:proofErr w:type="gramStart"/>
+      <w:r>
+        <w:t>{{ users</w:t>
+      </w:r>
+      <w:proofErr w:type="gramEnd"/>
+      <w:r>
+        <w:t>[0</w:t>
+      </w:r>
+      <w:proofErr w:type="gramStart"/>
+      <w:r>
+        <w:t>].</w:t>
+      </w:r>
+      <w:proofErr w:type="spellStart"/>
+      <w:r>
+        <w:t>address</w:t>
+      </w:r>
+      <w:proofErr w:type="gramEnd"/>
+      <w:r>
+        <w:t>.line_</w:t>
+      </w:r>
+      <w:proofErr w:type="gramStart"/>
+      <w:r>
+        <w:t>two</w:t>
+      </w:r>
+      <w:proofErr w:type="spellEnd"/>
+      <w:r>
+        <w:t>() }</w:t>
+      </w:r>
+      <w:proofErr w:type="gramEnd"/>
+      <w:r>
+        <w:t>}</w:t>
       </w:r>
     </w:p>
     <w:p>
       <w:r>
-        <w:t>{%p else %}</w:t>
+        <w:t>{%p endif %}</w:t>
       </w:r>
     </w:p>
     <w:p>
       <w:r>
-        <w:t>{{ users[0].signature_if_final(i) }}</w:t>
+        <w:t xml:space="preserve">{%p if </w:t>
+      </w:r>
+      <w:proofErr w:type="spellStart"/>
+      <w:r>
+        <w:t>showifdef</w:t>
+      </w:r>
+      <w:proofErr w:type="spellEnd"/>
+      <w:r>
+        <w:t>("users[0</w:t>
+      </w:r>
+      <w:proofErr w:type="gramStart"/>
+      <w:r>
+        <w:t>].</w:t>
+      </w:r>
+      <w:proofErr w:type="spellStart"/>
+      <w:r>
+        <w:t>phone</w:t>
+      </w:r>
+      <w:proofErr w:type="gramEnd"/>
+      <w:r>
+        <w:t>_number</w:t>
+      </w:r>
+      <w:proofErr w:type="spellEnd"/>
+      <w:r>
+        <w:t>") %}</w:t>
       </w:r>
     </w:p>
     <w:p>
-      <w:r>
-        <w:t>{{ users[0] }}</w:t>
+      <w:proofErr w:type="gramStart"/>
+      <w:r>
+        <w:t xml:space="preserve">{{ </w:t>
+      </w:r>
+      <w:proofErr w:type="spellStart"/>
+      <w:r>
+        <w:t>phone</w:t>
+      </w:r>
+      <w:proofErr w:type="gramEnd"/>
+      <w:r>
+        <w:t>_number_formatted</w:t>
+      </w:r>
+      <w:proofErr w:type="spellEnd"/>
+      <w:r>
+        <w:t>(</w:t>
+      </w:r>
+      <w:proofErr w:type="gramStart"/>
+      <w:r>
+        <w:t>users[</w:t>
+      </w:r>
+      <w:proofErr w:type="gramEnd"/>
+      <w:r>
+        <w:t>0</w:t>
+      </w:r>
+      <w:proofErr w:type="gramStart"/>
+      <w:r>
+        <w:t>].</w:t>
+      </w:r>
+      <w:proofErr w:type="spellStart"/>
+      <w:r>
+        <w:t>phone</w:t>
+      </w:r>
+      <w:proofErr w:type="gramEnd"/>
+      <w:r>
+        <w:t>_number</w:t>
+      </w:r>
+      <w:proofErr w:type="spellEnd"/>
+      <w:r>
+        <w:t>, country="US"</w:t>
+      </w:r>
+      <w:proofErr w:type="gramStart"/>
+      <w:r>
+        <w:t>) }</w:t>
+      </w:r>
+      <w:proofErr w:type="gramEnd"/>
+      <w:r>
+        <w:t>}</w:t>
       </w:r>
     </w:p>
     <w:p>
       <w:r>
-        <w:t>{{ users[0].address.line_one() }}</w:t>
+        <w:t>{%p endif %}</w:t>
       </w:r>
     </w:p>
     <w:p>
       <w:r>
-        <w:t>{{ users[0].address.line_two() }}</w:t>
+        <w:t xml:space="preserve">{%p if </w:t>
+      </w:r>
+      <w:proofErr w:type="spellStart"/>
+      <w:r>
+        <w:t>showifdef</w:t>
+      </w:r>
+      <w:proofErr w:type="spellEnd"/>
+      <w:r>
+        <w:t>("users[0</w:t>
+      </w:r>
+      <w:proofErr w:type="gramStart"/>
+      <w:r>
+        <w:t>].email</w:t>
+      </w:r>
+      <w:proofErr w:type="gramEnd"/>
+      <w:r>
+        <w:t>") %}</w:t>
       </w:r>
     </w:p>
     <w:p>
-      <w:r>
-        <w:t>{{ showifdef("users[0].email") }}</w:t>
+      <w:proofErr w:type="gramStart"/>
+      <w:r>
+        <w:t>{{ users</w:t>
+      </w:r>
+      <w:proofErr w:type="gramEnd"/>
+      <w:r>
+        <w:t>[0</w:t>
+      </w:r>
+      <w:proofErr w:type="gramStart"/>
+      <w:r>
+        <w:t>].email</w:t>
+      </w:r>
+      <w:proofErr w:type="gramEnd"/>
+      <w:r>
+        <w:t xml:space="preserve"> }}</w:t>
       </w:r>
     </w:p>
     <w:p>
       <w:r>
-        <w:t>{{ showifdef("users[0].phone_number") }}</w:t>
+        <w:t>{%p endif %}</w:t>
       </w:r>
     </w:p>
     <w:p>
       <w:r>
         <w:t>Defendant (self-represented/pro se)</w:t>
-      </w:r>
-    </w:p>
-    <w:p>
-      <w:r>
-        <w:t>{%p endif %}</w:t>
       </w:r>
     </w:p>
     <w:sectPr>
@@ -3952,17 +4224,6 @@
 </file>
 
 <file path=customXml/item1.xml><?xml version="1.0" encoding="utf-8"?>
-<p:properties xmlns:p="http://schemas.microsoft.com/office/2006/metadata/properties" xmlns:xsi="http://www.w3.org/2001/XMLSchema-instance" xmlns:pc="http://schemas.microsoft.com/office/infopath/2007/PartnerControls">
-  <documentManagement>
-    <lcf76f155ced4ddcb4097134ff3c332f xmlns="15335165-7242-4578-b7f0-21dda5d4421e">
-      <Terms xmlns="http://schemas.microsoft.com/office/infopath/2007/PartnerControls"/>
-    </lcf76f155ced4ddcb4097134ff3c332f>
-    <TaxCatchAll xmlns="7562f8c3-e17b-4183-af27-c0ef091db4fe" xsi:nil="true"/>
-  </documentManagement>
-</p:properties>
-</file>
-
-<file path=customXml/item2.xml><?xml version="1.0" encoding="utf-8"?>
 <ct:contentTypeSchema xmlns:ct="http://schemas.microsoft.com/office/2006/metadata/contentType" xmlns:ma="http://schemas.microsoft.com/office/2006/metadata/properties/metaAttributes" ct:_="" ma:_="" ma:contentTypeName="Document" ma:contentTypeID="0x0101009044A84E23759B4B87F3709C73402C4A" ma:contentTypeVersion="15" ma:contentTypeDescription="Create a new document." ma:contentTypeScope="" ma:versionID="9233f4bb4215c73a510003a9f072f138">
   <xsd:schema xmlns:xsd="http://www.w3.org/2001/XMLSchema" xmlns:xs="http://www.w3.org/2001/XMLSchema" xmlns:p="http://schemas.microsoft.com/office/2006/metadata/properties" xmlns:ns2="7562f8c3-e17b-4183-af27-c0ef091db4fe" xmlns:ns3="15335165-7242-4578-b7f0-21dda5d4421e" targetNamespace="http://schemas.microsoft.com/office/2006/metadata/properties" ma:root="true" ma:fieldsID="2cbbccbe6583eca55ddc0605d4581f42" ns2:_="" ns3:_="">
     <xsd:import namespace="7562f8c3-e17b-4183-af27-c0ef091db4fe"/>
@@ -4199,7 +4460,7 @@
 </ct:contentTypeSchema>
 </file>
 
-<file path=customXml/item3.xml><?xml version="1.0" encoding="utf-8"?>
+<file path=customXml/item2.xml><?xml version="1.0" encoding="utf-8"?>
 <?mso-contentType ?>
 <FormTemplates xmlns="http://schemas.microsoft.com/sharepoint/v3/contenttype/forms">
   <Display>DocumentLibraryForm</Display>
@@ -4208,22 +4469,22 @@
 </FormTemplates>
 </file>
 
-<file path=customXml/item4.xml><?xml version="1.0" encoding="utf-8"?>
+<file path=customXml/item3.xml><?xml version="1.0" encoding="utf-8"?>
 <b:Sources xmlns:b="http://schemas.openxmlformats.org/officeDocument/2006/bibliography" xmlns="http://schemas.openxmlformats.org/officeDocument/2006/bibliography" SelectedStyle="\APASixthEditionOfficeOnline.xsl" StyleName="APA" Version="6"/>
 </file>
 
-<file path=customXml/itemProps1.xml><?xml version="1.0" encoding="utf-8"?>
-<ds:datastoreItem xmlns:ds="http://schemas.openxmlformats.org/officeDocument/2006/customXml" ds:itemID="{1ED8A1FF-FADA-4751-815F-2BD5A1884232}">
-  <ds:schemaRefs>
-    <ds:schemaRef ds:uri="http://schemas.microsoft.com/office/2006/metadata/properties"/>
-    <ds:schemaRef ds:uri="http://schemas.microsoft.com/office/infopath/2007/PartnerControls"/>
-    <ds:schemaRef ds:uri="15335165-7242-4578-b7f0-21dda5d4421e"/>
-    <ds:schemaRef ds:uri="7562f8c3-e17b-4183-af27-c0ef091db4fe"/>
-  </ds:schemaRefs>
-</ds:datastoreItem>
+<file path=customXml/item4.xml><?xml version="1.0" encoding="utf-8"?>
+<p:properties xmlns:p="http://schemas.microsoft.com/office/2006/metadata/properties" xmlns:xsi="http://www.w3.org/2001/XMLSchema-instance" xmlns:pc="http://schemas.microsoft.com/office/infopath/2007/PartnerControls">
+  <documentManagement>
+    <lcf76f155ced4ddcb4097134ff3c332f xmlns="15335165-7242-4578-b7f0-21dda5d4421e">
+      <Terms xmlns="http://schemas.microsoft.com/office/infopath/2007/PartnerControls"/>
+    </lcf76f155ced4ddcb4097134ff3c332f>
+    <TaxCatchAll xmlns="7562f8c3-e17b-4183-af27-c0ef091db4fe" xsi:nil="true"/>
+  </documentManagement>
+</p:properties>
 </file>
 
-<file path=customXml/itemProps2.xml><?xml version="1.0" encoding="utf-8"?>
+<file path=customXml/itemProps1.xml><?xml version="1.0" encoding="utf-8"?>
 <ds:datastoreItem xmlns:ds="http://schemas.openxmlformats.org/officeDocument/2006/customXml" ds:itemID="{BDC87967-AA48-45EE-B0C5-83E3556A7F47}">
   <ds:schemaRefs>
     <ds:schemaRef ds:uri="http://schemas.microsoft.com/office/2006/metadata/contentType"/>
@@ -4242,7 +4503,7 @@
 </ds:datastoreItem>
 </file>
 
-<file path=customXml/itemProps3.xml><?xml version="1.0" encoding="utf-8"?>
+<file path=customXml/itemProps2.xml><?xml version="1.0" encoding="utf-8"?>
 <ds:datastoreItem xmlns:ds="http://schemas.openxmlformats.org/officeDocument/2006/customXml" ds:itemID="{F96B9AE6-015B-4478-A2E2-D7A8159C2E27}">
   <ds:schemaRefs>
     <ds:schemaRef ds:uri="http://schemas.microsoft.com/sharepoint/v3/contenttype/forms"/>
@@ -4250,10 +4511,21 @@
 </ds:datastoreItem>
 </file>
 
-<file path=customXml/itemProps4.xml><?xml version="1.0" encoding="utf-8"?>
+<file path=customXml/itemProps3.xml><?xml version="1.0" encoding="utf-8"?>
 <ds:datastoreItem xmlns:ds="http://schemas.openxmlformats.org/officeDocument/2006/customXml" ds:itemID="{0CCDB376-776B-457B-ABFC-E51C59B49863}">
   <ds:schemaRefs>
     <ds:schemaRef ds:uri="http://schemas.openxmlformats.org/officeDocument/2006/bibliography"/>
   </ds:schemaRefs>
 </ds:datastoreItem>
+</file>
+
+<file path=customXml/itemProps4.xml><?xml version="1.0" encoding="utf-8"?>
+<ds:datastoreItem xmlns:ds="http://schemas.openxmlformats.org/officeDocument/2006/customXml" ds:itemID="{1ED8A1FF-FADA-4751-815F-2BD5A1884232}">
+  <ds:schemaRefs>
+    <ds:schemaRef ds:uri="http://schemas.microsoft.com/office/2006/metadata/properties"/>
+    <ds:schemaRef ds:uri="http://schemas.microsoft.com/office/infopath/2007/PartnerControls"/>
+    <ds:schemaRef ds:uri="15335165-7242-4578-b7f0-21dda5d4421e"/>
+    <ds:schemaRef ds:uri="7562f8c3-e17b-4183-af27-c0ef091db4fe"/>
+  </ds:schemaRefs>
+</ds:datastoreItem>
 </file>
</xml_diff>

<commit_message>
Adds the ability for a representative of the defendant to sign on their behalf (relies on tested update to VTSharedYML to work)
</commit_message>
<xml_diff>
--- a/docassemble/VTSuperiorCourtDebtAnswer/data/templates/include_signature.docx
+++ b/docassemble/VTSuperiorCourtDebtAnswer/data/templates/include_signature.docx
@@ -47,8 +47,82 @@
       </w:r>
     </w:p>
     <w:p>
+      <w:r>
+        <w:t xml:space="preserve">{%p if </w:t>
+      </w:r>
+      <w:proofErr w:type="spellStart"/>
       <w:proofErr w:type="gramStart"/>
       <w:r>
+        <w:t>showifdef</w:t>
+      </w:r>
+      <w:proofErr w:type="spellEnd"/>
+      <w:r>
+        <w:t>(</w:t>
+      </w:r>
+      <w:proofErr w:type="gramEnd"/>
+      <w:r>
+        <w:t>"</w:t>
+      </w:r>
+      <w:proofErr w:type="spellStart"/>
+      <w:r>
+        <w:t>guardian_poa_conservator</w:t>
+      </w:r>
+      <w:proofErr w:type="spellEnd"/>
+      <w:r>
+        <w:t>", False) %}</w:t>
+      </w:r>
+    </w:p>
+    <w:p>
+      <w:proofErr w:type="gramStart"/>
+      <w:r>
+        <w:t xml:space="preserve">{{ </w:t>
+      </w:r>
+      <w:proofErr w:type="spellStart"/>
+      <w:r>
+        <w:t>representative</w:t>
+      </w:r>
+      <w:proofErr w:type="gramEnd"/>
+      <w:r>
+        <w:t>_</w:t>
+      </w:r>
+      <w:proofErr w:type="gramStart"/>
+      <w:r>
+        <w:t>name</w:t>
+      </w:r>
+      <w:proofErr w:type="spellEnd"/>
+      <w:r>
+        <w:t xml:space="preserve"> }</w:t>
+      </w:r>
+      <w:proofErr w:type="gramEnd"/>
+      <w:r>
+        <w:t xml:space="preserve">}, </w:t>
+      </w:r>
+      <w:proofErr w:type="gramStart"/>
+      <w:r>
+        <w:t xml:space="preserve">{{ </w:t>
+      </w:r>
+      <w:proofErr w:type="spellStart"/>
+      <w:r>
+        <w:t>representative</w:t>
+      </w:r>
+      <w:proofErr w:type="gramEnd"/>
+      <w:r>
+        <w:t>_</w:t>
+      </w:r>
+      <w:proofErr w:type="gramStart"/>
+      <w:r>
+        <w:t>role</w:t>
+      </w:r>
+      <w:proofErr w:type="spellEnd"/>
+      <w:r>
+        <w:t xml:space="preserve"> }</w:t>
+      </w:r>
+      <w:proofErr w:type="gramEnd"/>
+      <w:r>
+        <w:t xml:space="preserve">} of </w:t>
+      </w:r>
+      <w:proofErr w:type="gramStart"/>
+      <w:r>
         <w:t>{{ users</w:t>
       </w:r>
       <w:proofErr w:type="gramEnd"/>
@@ -62,6 +136,34 @@
       <w:proofErr w:type="gramEnd"/>
       <w:r>
         <w:t>}</w:t>
+      </w:r>
+    </w:p>
+    <w:p>
+      <w:r>
+        <w:t>{%p else %}</w:t>
+      </w:r>
+    </w:p>
+    <w:p>
+      <w:proofErr w:type="gramStart"/>
+      <w:r>
+        <w:t>{{ users</w:t>
+      </w:r>
+      <w:proofErr w:type="gramEnd"/>
+      <w:r>
+        <w:t>[0</w:t>
+      </w:r>
+      <w:proofErr w:type="gramStart"/>
+      <w:r>
+        <w:t>] }</w:t>
+      </w:r>
+      <w:proofErr w:type="gramEnd"/>
+      <w:r>
+        <w:t>}</w:t>
+      </w:r>
+    </w:p>
+    <w:p>
+      <w:r>
+        <w:t>{%p endif %}</w:t>
       </w:r>
     </w:p>
     <w:p>
@@ -4224,6 +4326,30 @@
 </file>
 
 <file path=customXml/item1.xml><?xml version="1.0" encoding="utf-8"?>
+<p:properties xmlns:p="http://schemas.microsoft.com/office/2006/metadata/properties" xmlns:xsi="http://www.w3.org/2001/XMLSchema-instance" xmlns:pc="http://schemas.microsoft.com/office/infopath/2007/PartnerControls">
+  <documentManagement>
+    <lcf76f155ced4ddcb4097134ff3c332f xmlns="15335165-7242-4578-b7f0-21dda5d4421e">
+      <Terms xmlns="http://schemas.microsoft.com/office/infopath/2007/PartnerControls"/>
+    </lcf76f155ced4ddcb4097134ff3c332f>
+    <TaxCatchAll xmlns="7562f8c3-e17b-4183-af27-c0ef091db4fe" xsi:nil="true"/>
+  </documentManagement>
+</p:properties>
+</file>
+
+<file path=customXml/item2.xml><?xml version="1.0" encoding="utf-8"?>
+<b:Sources xmlns:b="http://schemas.openxmlformats.org/officeDocument/2006/bibliography" xmlns="http://schemas.openxmlformats.org/officeDocument/2006/bibliography" SelectedStyle="\APASixthEditionOfficeOnline.xsl" StyleName="APA" Version="6"/>
+</file>
+
+<file path=customXml/item3.xml><?xml version="1.0" encoding="utf-8"?>
+<?mso-contentType ?>
+<FormTemplates xmlns="http://schemas.microsoft.com/sharepoint/v3/contenttype/forms">
+  <Display>DocumentLibraryForm</Display>
+  <Edit>DocumentLibraryForm</Edit>
+  <New>DocumentLibraryForm</New>
+</FormTemplates>
+</file>
+
+<file path=customXml/item4.xml><?xml version="1.0" encoding="utf-8"?>
 <ct:contentTypeSchema xmlns:ct="http://schemas.microsoft.com/office/2006/metadata/contentType" xmlns:ma="http://schemas.microsoft.com/office/2006/metadata/properties/metaAttributes" ct:_="" ma:_="" ma:contentTypeName="Document" ma:contentTypeID="0x0101009044A84E23759B4B87F3709C73402C4A" ma:contentTypeVersion="15" ma:contentTypeDescription="Create a new document." ma:contentTypeScope="" ma:versionID="9233f4bb4215c73a510003a9f072f138">
   <xsd:schema xmlns:xsd="http://www.w3.org/2001/XMLSchema" xmlns:xs="http://www.w3.org/2001/XMLSchema" xmlns:p="http://schemas.microsoft.com/office/2006/metadata/properties" xmlns:ns2="7562f8c3-e17b-4183-af27-c0ef091db4fe" xmlns:ns3="15335165-7242-4578-b7f0-21dda5d4421e" targetNamespace="http://schemas.microsoft.com/office/2006/metadata/properties" ma:root="true" ma:fieldsID="2cbbccbe6583eca55ddc0605d4581f42" ns2:_="" ns3:_="">
     <xsd:import namespace="7562f8c3-e17b-4183-af27-c0ef091db4fe"/>
@@ -4460,31 +4586,34 @@
 </ct:contentTypeSchema>
 </file>
 
-<file path=customXml/item2.xml><?xml version="1.0" encoding="utf-8"?>
-<?mso-contentType ?>
-<FormTemplates xmlns="http://schemas.microsoft.com/sharepoint/v3/contenttype/forms">
-  <Display>DocumentLibraryForm</Display>
-  <Edit>DocumentLibraryForm</Edit>
-  <New>DocumentLibraryForm</New>
-</FormTemplates>
+<file path=customXml/itemProps1.xml><?xml version="1.0" encoding="utf-8"?>
+<ds:datastoreItem xmlns:ds="http://schemas.openxmlformats.org/officeDocument/2006/customXml" ds:itemID="{1ED8A1FF-FADA-4751-815F-2BD5A1884232}">
+  <ds:schemaRefs>
+    <ds:schemaRef ds:uri="http://schemas.microsoft.com/office/2006/metadata/properties"/>
+    <ds:schemaRef ds:uri="http://schemas.microsoft.com/office/infopath/2007/PartnerControls"/>
+    <ds:schemaRef ds:uri="15335165-7242-4578-b7f0-21dda5d4421e"/>
+    <ds:schemaRef ds:uri="7562f8c3-e17b-4183-af27-c0ef091db4fe"/>
+  </ds:schemaRefs>
+</ds:datastoreItem>
 </file>
 
-<file path=customXml/item3.xml><?xml version="1.0" encoding="utf-8"?>
-<b:Sources xmlns:b="http://schemas.openxmlformats.org/officeDocument/2006/bibliography" xmlns="http://schemas.openxmlformats.org/officeDocument/2006/bibliography" SelectedStyle="\APASixthEditionOfficeOnline.xsl" StyleName="APA" Version="6"/>
+<file path=customXml/itemProps2.xml><?xml version="1.0" encoding="utf-8"?>
+<ds:datastoreItem xmlns:ds="http://schemas.openxmlformats.org/officeDocument/2006/customXml" ds:itemID="{0CCDB376-776B-457B-ABFC-E51C59B49863}">
+  <ds:schemaRefs>
+    <ds:schemaRef ds:uri="http://schemas.openxmlformats.org/officeDocument/2006/bibliography"/>
+  </ds:schemaRefs>
+</ds:datastoreItem>
 </file>
 
-<file path=customXml/item4.xml><?xml version="1.0" encoding="utf-8"?>
-<p:properties xmlns:p="http://schemas.microsoft.com/office/2006/metadata/properties" xmlns:xsi="http://www.w3.org/2001/XMLSchema-instance" xmlns:pc="http://schemas.microsoft.com/office/infopath/2007/PartnerControls">
-  <documentManagement>
-    <lcf76f155ced4ddcb4097134ff3c332f xmlns="15335165-7242-4578-b7f0-21dda5d4421e">
-      <Terms xmlns="http://schemas.microsoft.com/office/infopath/2007/PartnerControls"/>
-    </lcf76f155ced4ddcb4097134ff3c332f>
-    <TaxCatchAll xmlns="7562f8c3-e17b-4183-af27-c0ef091db4fe" xsi:nil="true"/>
-  </documentManagement>
-</p:properties>
+<file path=customXml/itemProps3.xml><?xml version="1.0" encoding="utf-8"?>
+<ds:datastoreItem xmlns:ds="http://schemas.openxmlformats.org/officeDocument/2006/customXml" ds:itemID="{F96B9AE6-015B-4478-A2E2-D7A8159C2E27}">
+  <ds:schemaRefs>
+    <ds:schemaRef ds:uri="http://schemas.microsoft.com/sharepoint/v3/contenttype/forms"/>
+  </ds:schemaRefs>
+</ds:datastoreItem>
 </file>
 
-<file path=customXml/itemProps1.xml><?xml version="1.0" encoding="utf-8"?>
+<file path=customXml/itemProps4.xml><?xml version="1.0" encoding="utf-8"?>
 <ds:datastoreItem xmlns:ds="http://schemas.openxmlformats.org/officeDocument/2006/customXml" ds:itemID="{BDC87967-AA48-45EE-B0C5-83E3556A7F47}">
   <ds:schemaRefs>
     <ds:schemaRef ds:uri="http://schemas.microsoft.com/office/2006/metadata/contentType"/>
@@ -4501,31 +4630,4 @@
     <ds:schemaRef ds:uri="http://schemas.microsoft.com/internal/obd"/>
   </ds:schemaRefs>
 </ds:datastoreItem>
-</file>
-
-<file path=customXml/itemProps2.xml><?xml version="1.0" encoding="utf-8"?>
-<ds:datastoreItem xmlns:ds="http://schemas.openxmlformats.org/officeDocument/2006/customXml" ds:itemID="{F96B9AE6-015B-4478-A2E2-D7A8159C2E27}">
-  <ds:schemaRefs>
-    <ds:schemaRef ds:uri="http://schemas.microsoft.com/sharepoint/v3/contenttype/forms"/>
-  </ds:schemaRefs>
-</ds:datastoreItem>
-</file>
-
-<file path=customXml/itemProps3.xml><?xml version="1.0" encoding="utf-8"?>
-<ds:datastoreItem xmlns:ds="http://schemas.openxmlformats.org/officeDocument/2006/customXml" ds:itemID="{0CCDB376-776B-457B-ABFC-E51C59B49863}">
-  <ds:schemaRefs>
-    <ds:schemaRef ds:uri="http://schemas.openxmlformats.org/officeDocument/2006/bibliography"/>
-  </ds:schemaRefs>
-</ds:datastoreItem>
-</file>
-
-<file path=customXml/itemProps4.xml><?xml version="1.0" encoding="utf-8"?>
-<ds:datastoreItem xmlns:ds="http://schemas.openxmlformats.org/officeDocument/2006/customXml" ds:itemID="{1ED8A1FF-FADA-4751-815F-2BD5A1884232}">
-  <ds:schemaRefs>
-    <ds:schemaRef ds:uri="http://schemas.microsoft.com/office/2006/metadata/properties"/>
-    <ds:schemaRef ds:uri="http://schemas.microsoft.com/office/infopath/2007/PartnerControls"/>
-    <ds:schemaRef ds:uri="15335165-7242-4578-b7f0-21dda5d4421e"/>
-    <ds:schemaRef ds:uri="7562f8c3-e17b-4183-af27-c0ef091db4fe"/>
-  </ds:schemaRefs>
-</ds:datastoreItem>
 </file>
</xml_diff>